<commit_message>
Atualiza diagnóstico Refúgio dos 4 Elementos: capacidade real da agenda, orçamento de tráfego pago e localização confirmada
</commit_message>
<xml_diff>
--- a/refugio-dos-4-elementos/diagnostico-estrategico.docx
+++ b/refugio-dos-4-elementos/diagnostico-estrategico.docx
@@ -49,7 +49,7 @@
     </w:p>
     <w:p>
       <w:r>
-        <w:t>A capacidade de atendimento está muito acima da demanda atual: a operação consegue atender até 40 pessoas/mês (e a Constelação em grupo está estruturalmente limitada a 2 pessoas/dia, só às terças à noite), mas hoje fecha apenas ~2 atendimentos por mês. Isso não é um problema de capacidade — é um problema de visibilidade e captação.</w:t>
+        <w:t>Hoje a operação fecha apenas ~2 atendimentos por mês, mas isso reflete a agenda reservada atual, não um teto real: o único horário fixo hoje é terça à noite, com espaço pra 1 atendimento de Constelação Familiar ou 2 atendimentos mais rápidos de outras terapias por semana. À medida que o fluxo de interessados crescer, o espaço consegue se reorganizar e abrir mais horários/dias, com capacidade declarada de até 40 atendimentos/mês. Ou seja: a demanda de hoje é baixa porque a visibilidade é baixa, não porque a agenda está saturada — mas o crescimento de agendamentos precisa ser pareado com a reorganização real da agenda, que é um processo gradual e não automático.</w:t>
       </w:r>
     </w:p>
     <w:p>
@@ -65,19 +65,19 @@
         <w:rPr>
           <w:b/>
         </w:rPr>
-        <w:t>Divergência geográfica (a esclarecer com a cliente antes de fechar o plano):</w:t>
+        <w:t>Divergência geográfica (resolvida pela cliente):</w:t>
       </w:r>
       <w:r>
-        <w:t xml:space="preserve"> Daniela descreve a operação como majoritariamente online, com público concentrado em Goiânia-GO. Jean Carlos descreve uma operação predominantemente presencial, com pacientes de bairros de Cuiabá e Várzea Grande (MT), e até clientes fora do estado (Salvador/BA, Porto Alegre/RS) e uma de Cáceres-MT. Essa diferença é grande demais pra ser só percepção — ou (a) Daniela atende uma frente online a partir de Goiânia enquanto outros consteladores do espaço atendem presencialmente em Cuiabá/MT, ou (b) há uma confusão de cidade entre os dois respondentes. </w:t>
+        <w:t xml:space="preserve"> Daniela mencionou Goiânia-GO porque é onde a irmã dela atende — não é a base real de operação. O foco confirmado é </w:t>
       </w:r>
       <w:r>
         <w:rPr>
           <w:b/>
         </w:rPr>
-        <w:t>Recomendação: confirmar diretamente com a cliente antes de definir a segmentação geográfica de qualquer campanha de tráfego pago</w:t>
+        <w:t>atendimento online para o Brasil todo + atendimento presencial em Cuiabá e nos eventos ao redor de MT</w:t>
       </w:r>
       <w:r>
-        <w:t xml:space="preserve"> — anunciar pra cidade errada queima orçamento de um cliente que já trabalha com R$300/mês.</w:t>
+        <w:t>, alinhado com o que Jean Carlos descreveu (pacientes de Cuiabá, Várzea Grande, Cáceres e presença pontual fora do estado). A segmentação geográfica de qualquer campanha de tráfego pago deve usar essa base: sem restrição de cidade/estado para os anúncios de captação online, e foco em Cuiabá/região de MT para tudo que for presencial ou de evento (ex: Imersão).</w:t>
       </w:r>
     </w:p>
     <w:p>
@@ -167,7 +167,7 @@
         <w:pStyle w:val="ListBullet"/>
       </w:pPr>
       <w:r>
-        <w:t>Capacidade ociosa grande (40/mês de capacidade vs. 2/mês de demanda atual) — qualquer ganho de visibilidade tem espaço enorme pra converter em agendamento real sem gargalo operacional</w:t>
+        <w:t>Capacidade expansível (até 40/mês conforme a agenda se reorganiza, partindo de 1-2 atendimentos/semana hoje) — qualquer ganho de visibilidade tem espaço real pra converter em agendamento, desde que o crescimento de leads seja pareado com a reorganização gradual da agenda</w:t>
       </w:r>
     </w:p>
     <w:p>
@@ -332,7 +332,7 @@
     </w:p>
     <w:p>
       <w:r>
-        <w:t>Pessoas entre aproximadamente 30 e 50 anos, com abertura à visão holística/espiritual, que tomaram consciência de que precisam de ajuda — independente de idade ou posição social. Vivem ou já viveram exaustão mental, insônia, medo, síndrome do pânico, dependência química, dificuldades financeiras ou um padrão familiar repetitivo que não conseguem nomear sozinhas. Buscam resgatar sua essência, se libertar de pendências emocionais herdadas da família, reconciliar relações e ganhar mais clareza para evoluir na carreira/vida social. Hoje chegam quase exclusivamente por indicação — confiam em recomendação pessoal mais do que em publicidade direta, o que reforça a importância de prova social (depoimentos) na comunicação.</w:t>
+        <w:t>Pessoas entre aproximadamente 30 e 50 anos, com abertura à visão holística/espiritual, que tomaram consciência de que precisam de ajuda — independente de idade ou posição social. Vivem ou já viveram exaustão mental, insônia, medo, síndrome do pânico, dependência química, dificuldades financeiras ou um padrão familiar repetitivo que não conseguem nomear sozinhas. Buscam resgatar sua essência, se libertar de pendências emocionais herdadas da família, reconciliar relações e ganhar mais clareza para evoluir na carreira/vida social. Hoje chegam quase exclusivamente por indicação — confiam em recomendação pessoal mais do que em publicidade direta, o que reforça a importância de prova social (depoimentos) na comunicação. Geograficamente, dividem-se em dois grupos: quem busca atendimento online (sem restrição de localização, Brasil todo) e quem busca atendimento presencial ou participação em eventos/imersões (concentrado em Cuiabá e região de MT).</w:t>
       </w:r>
     </w:p>
     <w:p>
@@ -551,7 +551,7 @@
           <w:p>
             <w:r/>
             <w:r>
-              <w:t>Confirmação de geolocalização real do público (ver divergência geográfica) antes de qualquer campanha rodar</w:t>
+              <w:t>Ritmo de veiculação pareado à capacidade real da agenda (1 vaga de Constelação/semana hoje) — gerar lead sem capacidade de atender frustra o prospect e desperdiça orçamento</w:t>
             </w:r>
           </w:p>
         </w:tc>
@@ -825,10 +825,30 @@
         <w:rPr>
           <w:b/>
         </w:rPr>
+        <w:t>Orçamento e ritmo de veiculação:</w:t>
+      </w:r>
+      <w:r>
+        <w:t xml:space="preserve"> A cliente confirmou orçamento de R$300/mês, com R$1.200 reservados no total — ou seja, 4 meses de runway. Recomendação: rodar </w:t>
+      </w:r>
+      <w:r>
+        <w:rPr>
+          <w:b/>
+        </w:rPr>
+        <w:t>R$10/dia, todos os 7 dias da semana</w:t>
+      </w:r>
+      <w:r>
+        <w:t>, em vez de concentrar R$15/dia só de segunda a sexta. Razões: (1) o algoritmo do Meta sai da fase de aprendizado com dados consistentes — pausar e reiniciar nos fins de semana reseta esse aprendizado e tende a piorar o custo por lead em vez de melhorar; (2) o público de terapia/espiritualidade navega Instagram em qualquer dia, inclusive fins de semana; (3) como a capacidade real hoje é de só 1 horário fixo (terça à noite), um fluxo constante e baixo de leads é mais fácil de absorver do que picos concentrados em dias específicos — permite formar fila de espera de forma organizada enquanto a agenda se expande. Objetivo de campanha: mensagem direta no WhatsApp (custo por lead mais baixo que campanhas de clique pro site, que ainda não existe).</w:t>
+      </w:r>
+    </w:p>
+    <w:p>
+      <w:r>
+        <w:rPr>
+          <w:b/>
+        </w:rPr>
         <w:t>30 dias:</w:t>
       </w:r>
       <w:r>
-        <w:t xml:space="preserve"> Antes de qualquer campanha ir ao ar, confirmar com a cliente a real geografia de atendimento (Goiânia online vs. Cuiabá/Várzea Grande presencial) para não desperdiçar o orçamento de R$300/mês com segmentação errada. Rodar primeira campanha de captação de leads via WhatsApp com orçamento baixo (~R$300/mês), focada no serviço de Constelação Familiar (gratuita ou de entrada) como isca, já que é o formato com tração histórica comprovada.</w:t>
+        <w:t xml:space="preserve"> Rodar primeira campanha de captação de leads via WhatsApp com R$10/dia contínuo, segmentação sem restrição geográfica (foco Brasil todo, formato online), focada no serviço de Constelação Familiar (gratuita ou de entrada) como isca — é o formato com tração histórica comprovada. Acompanhar de perto o ritmo de entrada de leads frente à capacidade real da agenda (1 vaga de Constelação ou 2 atendimentos rápidos por semana) para não gerar fila maior do que o espaço consegue absorver no início.</w:t>
       </w:r>
     </w:p>
     <w:p>
@@ -839,7 +859,7 @@
         <w:t>60 dias:</w:t>
       </w:r>
       <w:r>
-        <w:t xml:space="preserve"> Com dados da primeira campanha, testar uma segunda linha de anúncio para Ayahuasca/Imersão na Cachoeira — produtos de ticket mais alto, mas que exigem comunicação mais cuidadosa (vide objeções religiosas/legais do segmento). Considerar campanha sazonal específica se a Imersão presencial de fim de ano for confirmada.</w:t>
+        <w:t xml:space="preserve"> Com dados da primeira campanha (CPL, taxa de resposta no WhatsApp), testar uma segunda linha de anúncio para Ayahuasca/Imersão na Cachoeira — produtos de ticket mais alto, mas que exigem comunicação mais cuidadosa (vide objeções religiosas/legais do segmento). Para tudo que for presencial/evento, usar segmentação geográfica em Cuiabá e região de MT. Considerar campanha sazonal específica se a Imersão presencial de fim de ano for confirmada.</w:t>
       </w:r>
     </w:p>
     <w:p>
@@ -850,7 +870,7 @@
         <w:t>90 dias:</w:t>
       </w:r>
       <w:r>
-        <w:t xml:space="preserve"> Avaliar custo por lead e taxa de conversão em agendamento das duas linhas testadas. Usar esse dado para sustentar a conversa de upgrade de orçamento mensal (de R$300 para a faixa R$300–600 que Jean Carlos já indicou como aceitável).</w:t>
+        <w:t xml:space="preserve"> Avaliar custo por lead e taxa de conversão em agendamento das duas linhas testadas, e cruzar com o ritmo de reorganização real da agenda (quantos novos horários foram abertos). Usar esse dado pra sustentar a conversa de upgrade de orçamento mensal (de R$300 para a faixa R$300–600 que Jean Carlos já indicou como aceitável) — e pra decidir se o runway de R$1.200 deve ser usado nos 4 meses no ritmo atual ou se vale acelerar antes, caso o CPL esteja muito baixo.</w:t>
       </w:r>
     </w:p>
     <w:p>

</xml_diff>